<commit_message>
Termos de Abertura/Encerramento: assinatura so do Guilherme
Lei 6.404/76 nao exige contador para o Livro de Registro de Acoes
Nominativas (livro societario, nao contabil) - a dupla assinatura da
versao de 2025-02-28 (Jair + Wellington/MedFiscal) foi pratica da
empresa, nao exigencia legal. Remove o bloco de assinatura do contador
dos dois Termos, deixando so a do representante legal.

Co-Authored-By: Claude Sonnet 5 <noreply@anthropic.com>
</commit_message>
<xml_diff>
--- a/H2/Governanca/2026-07-23-TERMO-ABERTURA-livro-registro-acoes.docx
+++ b/H2/Governanca/2026-07-23-TERMO-ABERTURA-livro-registro-acoes.docx
@@ -159,58 +159,6 @@
           <w:szCs w:val="24"/>
         </w:rPr>
         <w:t xml:space="preserve">Diretor</w:t>
-      </w:r>
-    </w:p>
-    <w:p>
-      <w:pPr>
-        <w:spacing w:after="0" w:before="400"/>
-        <w:jc w:val="center"/>
-      </w:pPr>
-      <w:r>
-        <w:rPr>
-          <w:sz w:val="24"/>
-          <w:szCs w:val="24"/>
-        </w:rPr>
-        <w:t xml:space="preserve">_______________________________________________</w:t>
-      </w:r>
-    </w:p>
-    <w:p>
-      <w:pPr>
-        <w:spacing w:after="0" w:before="400"/>
-        <w:jc w:val="center"/>
-      </w:pPr>
-      <w:r>
-        <w:rPr>
-          <w:sz w:val="24"/>
-          <w:szCs w:val="24"/>
-        </w:rPr>
-        <w:t xml:space="preserve">[NOME COMPLETO DO CONTADOR RESPONSÁVEL — A CONFIRMAR]</w:t>
-      </w:r>
-    </w:p>
-    <w:p>
-      <w:pPr>
-        <w:spacing w:after="0" w:before="400"/>
-        <w:jc w:val="center"/>
-      </w:pPr>
-      <w:r>
-        <w:rPr>
-          <w:sz w:val="24"/>
-          <w:szCs w:val="24"/>
-        </w:rPr>
-        <w:t xml:space="preserve">Contador(a) — CRC [A CONFIRMAR]</w:t>
-      </w:r>
-    </w:p>
-    <w:p>
-      <w:pPr>
-        <w:spacing w:after="0" w:before="400"/>
-        <w:jc w:val="center"/>
-      </w:pPr>
-      <w:r>
-        <w:rPr>
-          <w:sz w:val="24"/>
-          <w:szCs w:val="24"/>
-        </w:rPr>
-        <w:t xml:space="preserve">(referência anterior: Wellington, MedFiscal — confirmar nome completo e nº de CRC atual antes de colher assinatura)</w:t>
       </w:r>
     </w:p>
     <w:sectPr>

</xml_diff>